<commit_message>
Apply final adversarial check to GEO paper
Tighten 22 citing sentences flagged against recorded facts and resolve
15 reviewer points: define the no-purchase-entry answer consistently,
route the platform disclosure duty through a statute amendment or
administrative regulation per Legislation Law arts. 91-92, carry the
informational/manipulative GEO split into abstract and conclusion, limit
platform commitments to their own ads, fix Table 2 actors and revenue,
correct the 2016 Measures row, and compress the abstract to 386 chars.

Co-Authored-By: Claude Opus 5.5 <noreply@anthropic.com>
Claude-Session: https://claude.ai/code/session_01D8mN5BKBxkXVuQbdpiwRxv
</commit_message>
<xml_diff>
--- a/geo-paper/GEO广告化论文.docx
+++ b/geo-paper/GEO广告化论文.docx
@@ -73,7 +73,7 @@
           <w:sz w:val="21"/>
           <w:szCs w:val="21"/>
         </w:rPr>
-        <w:t xml:space="preserve">生成式引擎以整合式回答取代链接列表，生成式引擎优化（GEO）随之被经营者用作不经平台广告系统的广告投放手段。本文综合计算机科学、广告学与法学文献，比对10部规范文本，并结合2026年的平台与监管动态展开分析。研究发现：GEO作用于检索召回、上下文分配与引用生成三个环节，现有证据中最稳定的影响因素是话题相关性和上下文位置；AI搜索中的商业信息形成平台广告与第三方GEO内容并存的结构，后者在信源端可认定为广告，进入不附购买入口的回答后却没有承担标识义务的广告发布者；GEO与信息操纵的区别在于内容是否真实、是否利用模型漏洞；生成结果的随机性使GEO效果难以审计。据此，本文提出按推销目的认定广告属性、在信源端设置随检索传递的商业标记、明确GEO服务商的广告经营者与发布者责任、以多引擎重复抽样验收效果等治理建议。</w:t>
+        <w:t xml:space="preserve">生成式引擎以整合式回答取代链接列表，生成式引擎优化（GEO）随之被经营者用作不经平台广告系统的广告投放手段。本文综合计算机科学、广告学与法学文献，比对10部规范文本，并结合2026年的平台与监管动态展开分析。研究发现：GEO作用于检索召回、上下文分配与引用生成三个环节，现有证据中最可靠的影响因素是话题相关性和上下文位置；AI搜索中的商业信息形成平台广告与第三方GEO内容并存的结构，后者在信源端可认定为广告，进入平台既未附加购买入口、也未收取对价的回答后，却没有承担标识义务的广告发布者；信息型GEO与操纵型GEO的区别在于内容是否真实、是否利用模型漏洞；生成结果的随机性使GEO效果难以审计。本文提出按推销目的认定广告属性、在信源端设置随检索传递的商业标记、通过修改《广告法》或制定行政法规设定商业来源提示义务、明确GEO服务商的责任、以多引擎重复抽样验收效果等建议。</w:t>
       </w:r>
     </w:p>
     <w:p>
@@ -245,7 +245,7 @@
           <w:sz w:val="21"/>
           <w:szCs w:val="21"/>
         </w:rPr>
-        <w:t xml:space="preserve">As generative engines replace ranked links with synthesized answers, businesses have begun to use Generative Engine Optimization (GEO) to advertise without going through platform ad systems. Combining literature from computer science, advertising and law, comparing ten regulatory texts, and drawing on platform and regulatory developments in 2026, this paper finds the following. GEO works at three stages, namely retrieval, context allocation and citation generation, and the most stable factors in current evidence are topical relevance and position in the context window. Commercial information in AI search follows two tracks, platform ads and third-party GEO content; the latter can be identified as advertising at its source, but once a model rewrites it into an answer without a purchase entry, no party qualifies under current rules as the advertising publisher responsible for labeling it. GEO and information manipulation differ in whether the content is truthful and whether it exploits model weaknesses. The randomness of generated answers makes GEO results hard to audit. The paper proposes judging advertising nature by promotional purpose, attaching source-level commercial markers that travel through retrieval, clarifying GEO providers' liability as advertising operators and publishers, and verifying results by repeated multi-engine sampling.</w:t>
+        <w:t xml:space="preserve">As generative engines replace ranked links with synthesized answers, businesses have begun to use Generative Engine Optimization (GEO) to advertise without going through platform ad systems. Combining literature from computer science, advertising and law, comparing ten regulatory texts, and drawing on platform and regulatory developments in 2026, this paper finds the following. GEO works at three stages, namely retrieval, context allocation and citation generation, and the most reliable factors in current evidence are topical relevance and position in the context window, while whether a source belongs to the third-party media that engines favor also affects its chance of being cited. Commercial information in AI search follows two tracks, platform ads and third-party GEO content; the latter can be identified as advertising at its source, but once a model rewrites it into an answer to which the platform neither attaches a purchase entry nor receives payment for, no party qualifies under current rules as the advertising publisher responsible for labeling it. Informational GEO and manipulative GEO differ in whether the content is truthful and whether it exploits model weaknesses. The randomness of generated answers makes GEO results hard to audit. The paper proposes judging advertising nature by promotional purpose, attaching source-level commercial markers that travel through retrieval, creating a duty for generative AI providers to disclose commercial sources through an amendment to the Advertising Law or an administrative regulation, clarifying GEO providers' liability as advertising operators and publishers, and verifying results by repeated multi-engine sampling.</w:t>
       </w:r>
     </w:p>
     <w:p>
@@ -391,7 +391,7 @@
           <w:sz w:val="24"/>
           <w:szCs w:val="24"/>
         </w:rPr>
-        <w:t xml:space="preserve">商业信息随之进入AI回答。谷歌于2024年10月在美国移动端的AI概览中上线广告，现有的搜索、购物和效果最大化广告系列自动获得展示资格</w:t>
+        <w:t xml:space="preserve">AI回答中也开始出现商业信息。谷歌于2024年10月在美国移动端的AI概览中上线广告，现有的搜索、购物和效果最大化广告系列自动获得展示资格</w:t>
       </w:r>
       <w:r>
         <w:rPr>
@@ -433,7 +433,7 @@
           <w:sz w:val="24"/>
           <w:szCs w:val="24"/>
         </w:rPr>
-        <w:t xml:space="preserve">，2026年2月又以用户信任为由宣布逐步退出广告业务</w:t>
+        <w:t xml:space="preserve">，2026年2月又以用户信任为由开始逐步退出广告业务</w:t>
       </w:r>
       <w:r>
         <w:rPr>
@@ -677,7 +677,7 @@
           <w:sz w:val="24"/>
           <w:szCs w:val="24"/>
         </w:rPr>
-        <w:t xml:space="preserve">GEO由此提出了三个尚未得到系统回答的问题，本文依次讨论：（1）GEO通过哪些环节进入AI回答，与平台广告构成何种关系；（2）GEO广告化给广告可识别性、信息质量、市场竞争和效果计量带来哪些风险；（3）现行广告规则与人工智能规则在哪些环节失效，义务应如何在广告主、GEO服务商、生成式引擎平台与监管部门之间分配。本文的贡献有三点：把GEO界定为不经平台广告系统、以回答正文为载体的广告形态，提出平台广告与第三方GEO内容并存的分析框架；通过规范文本比对，指出现行规则在不附购买入口的AI回答中缺少承担标识义务的主体；提出按推销目的认定广告属性、在信源端设置可传递的商业标记、以重复抽样验收效果的治理方案。</w:t>
+        <w:t xml:space="preserve">GEO由此提出了三个尚未得到系统回答的问题，本文依次讨论：（1）GEO通过哪些环节进入AI回答，与平台广告构成何种关系；（2）GEO广告化给广告可识别性、信息质量、市场竞争和效果计量带来哪些风险；（3）现行广告规则与人工智能规则在哪些环节失效，义务应如何在广告主、GEO服务商、生成式引擎平台与监管部门之间分配。本文的贡献有三点：把GEO界定为不经平台广告系统、以回答正文为载体的广告形态，提出平台广告与第三方GEO内容并存的分析框架；通过规范文本比对，指出现行规则在不附购买入口的AI回答中缺少承担标识义务的主体；提出按推销目的认定广告属性、在信源端设置可传递的商业标记、为生成式人工智能服务提供者设定商业来源提示义务、以重复抽样验收效果的治理方案。</w:t>
       </w:r>
     </w:p>
     <w:p>
@@ -1638,7 +1638,7 @@
           <w:sz w:val="24"/>
           <w:szCs w:val="24"/>
         </w:rPr>
-        <w:t xml:space="preserve">文献检索于2026年10月完成。检索入口包括Google Scholar，ACM Digital Library、ACL Anthology、NeurIPS、ICLR与USENIX Security会议论文集，arXiv，INFORMS期刊平台，以及国内期刊官网、国家自然科学基金委员会网站和国家哲学社会科学文献中心。英文检索词为generative engine optimization、generative search engine、LLM advertising、ad auction、native advertising disclosure、persuasion knowledge等，中文检索词为生成式引擎优化、AI搜索、计算广告、原生广告、植入式广告、竞价排名、可识别性等。纳入标准为：①研究对象是生成式引擎或对话式搜索中的内容可见性、广告投放或排序操纵；②属于搜索广告、计算广告、广告披露或隐蔽广告规制领域的基础研究；③界定检索增强生成、生成式人工智能内容治理等本文核心概念所必需；④能够在出版方、期刊官网、数据库或预印本平台核实作者、出处与主要结论。最终纳入学术文献34篇，包括生成式引擎与GEO研究10篇、大语言模型广告与生成式原生广告研究8篇、搜索广告与计算广告研究6篇、广告披露与说服知识研究5篇、法学与治理研究4篇，以及作为对话对象的唐欣琳（2026）。</w:t>
+        <w:t xml:space="preserve">文献检索于2026年10月完成。检索入口包括Google Scholar，ACM Digital Library、ACL Anthology、NeurIPS、ICLR与USENIX Security会议论文集，arXiv，INFORMS期刊平台，以及国内期刊官网、国家自然科学基金委员会网站和国家哲学社会科学文献中心。英文检索词为generative engine optimization、generative search engine、LLM advertising、ad auction、native advertising disclosure、persuasion knowledge等，中文检索词为生成式引擎优化、AI搜索、计算广告、原生广告、植入式广告、竞价排名、可识别性等。纳入标准为：①研究对象是生成式引擎、对话式搜索或大语言模型代理中的内容可见性、广告投放或排序操纵；②属于搜索广告、计算广告、广告披露或隐蔽广告规制领域的基础研究；③界定检索增强生成、生成式人工智能内容治理等本文核心概念所必需；④能够在出版方、期刊官网、数据库或预印本平台核实作者、出处与主要结论。最终纳入学术文献34篇，包括生成式引擎与GEO研究10篇、大语言模型广告与生成式原生广告研究8篇、搜索广告与计算广告研究6篇、广告披露与说服知识研究5篇、法学与治理研究4篇，以及作为对话对象的唐欣琳（2026）。</w:t>
       </w:r>
     </w:p>
     <w:p>
@@ -1655,7 +1655,7 @@
           <w:sz w:val="24"/>
           <w:szCs w:val="24"/>
         </w:rPr>
-        <w:t xml:space="preserve">规范文本共10部，包括《中华人民共和国广告法》《中华人民共和国电子商务法》《网络信息内容生态治理规定》、已于2023年废止的《互联网广告管理暂行办法》《互联网信息服务算法推荐管理规定》《互联网广告管理办法》《生成式人工智能服务管理暂行办法》《互联网广告可识别性执法指南》《人工智能生成合成内容标识办法》和2025年修订的《中华人民共和国反不正当竞争法》。本文对每部文本提取规范对象和与GEO相关的规定，判断其能否覆盖GEO的信源发布与AI回答呈现两个环节，结果见表3；讨论立法建议时另行援引《中华人民共和国立法法》。2026年的监管与行业文件4份作为政策材料纳入：市场监管总局关于深化互联网广告生态治理的通知及整治重点任务、中央网信办“清朗·整治AI应用乱象”专项行动、市场监管总局《广告引证内容执法指南》，以及中国商务广告协会的GEO系列团体标准。</w:t>
+        <w:t xml:space="preserve">规范文本共10部，包括《中华人民共和国广告法》《中华人民共和国电子商务法》《网络信息内容生态治理规定》、已于2023年废止的《互联网广告管理暂行办法》《互联网信息服务算法推荐管理规定》《互联网广告管理办法》《生成式人工智能服务管理暂行办法》《互联网广告可识别性执法指南》《人工智能生成合成内容标识办法》和2025年修订的《中华人民共和国反不正当竞争法》。本文对每部文本提取规范对象和与GEO相关的规定，判断其能否覆盖GEO的信源发布与AI回答呈现两个环节，结果见表3；讨论立法建议时另行援引《中华人民共和国立法法》。2026年的4项监管与行业动态作为政策材料纳入：市场监管总局关于深化互联网广告生态治理的通知及整治重点任务、中央网信办“清朗·整治AI应用乱象”专项行动、市场监管总局《广告引证内容执法指南》，以及中国商务广告协会的GEO系列团体标准。</w:t>
       </w:r>
     </w:p>
     <w:p>
@@ -1672,7 +1672,7 @@
           <w:sz w:val="24"/>
           <w:szCs w:val="24"/>
         </w:rPr>
-        <w:t xml:space="preserve">事件材料的选择标准为：由国家级媒体发布或转载、记录了GEO的具体操作过程、可以公开核验。据此选取新华社2026年1月的调查和央视2026年“3·15”晚会的曝光，并以经济日报的相关评论补充操作细节。平台材料取自谷歌、Perplexity、OpenAI、百度的官方公告、财报和业绩会实录，以及关于豆包、千问购物功能的媒体报道。</w:t>
+        <w:t xml:space="preserve">事件材料的选择标准为：由国家级媒体发布或转载、记录了GEO的具体操作过程、可以公开核验。据此选取新华社2026年1月的调查和央视2026年“3·15”晚会的曝光，晚会内容据新浪财经的报道转引，并以新华网转载的经济日报评论补充操作细节。平台材料取自谷歌、OpenAI的官方公告，百度的财报和第三方整理的业绩会实录，以及关于Perplexity广告业务和豆包、千问购物功能的行业媒体报道。</w:t>
       </w:r>
     </w:p>
     <w:p>
@@ -1761,7 +1761,7 @@
           <w:sz w:val="24"/>
           <w:szCs w:val="24"/>
         </w:rPr>
-        <w:t xml:space="preserve">引用标注并不保证回答可以核验。Liu等对Bing Chat、NeevaAI、perplexity.ai和YouChat的人工评估显示，平均只有51.5%的生成语句得到引用的完整支持，只有74.5%的引用支持其所附语句；在这四个系统之间，用户感知越有用的引擎，引用精确率越低（r=-0.96）</w:t>
+        <w:t xml:space="preserve">引用标注并不保证回答可以核验。Liu等对Bing Chat、NeevaAI、perplexity.ai和YouChat的人工评估显示，平均只有51.5%的生成语句得到引用的完整支持，只有74.5%的引用支持其所附语句；在这四个系统之间，用户感知越有用的引擎，引用精确率越低（r=−0.96）</w:t>
       </w:r>
       <w:r>
         <w:rPr>
@@ -1820,7 +1820,7 @@
           <w:sz w:val="24"/>
           <w:szCs w:val="24"/>
         </w:rPr>
-        <w:t xml:space="preserve">。Martinez的综述进一步指出，GEO是覆盖检索激活、抓取索引、检索、重排与上下文分配、引用和用户行为的多阶段过程，其中话题相关性和上下文位置是现有研究中最可靠的影响因素，通用改写技巧的迁移性较差</w:t>
+        <w:t xml:space="preserve">。Martinez的综述进一步指出，GEO是覆盖检索激活、抓取索引、检索、重排与上下文分配、引用、显著性、事实吸收、保真度和用户行为的多阶段过程，其中话题相关性和上下文位置是现有研究中最可靠的影响因素，通用优化技巧的迁移性较差</w:t>
       </w:r>
       <w:r>
         <w:rPr>
@@ -1841,7 +1841,7 @@
           <w:sz w:val="24"/>
           <w:szCs w:val="24"/>
         </w:rPr>
-        <w:t xml:space="preserve">。本文把经营者以推销其商品或服务为目的、自行或委托服务商实施的GEO称为广告性GEO，把GEO由内容可见性技术转为此类用途的过程称为GEO广告化。</w:t>
+        <w:t xml:space="preserve">。本文把经营者以推销其商品或服务为目的、自行或委托服务商实施的GEO称为广告性GEO，把GEO由内容可见性技术转为此类用途的过程称为GEO广告化。除引述文献外，下文所称GEO均指广告性GEO，并按5.2节分为信息型GEO与操纵型GEO。</w:t>
       </w:r>
     </w:p>
     <w:p>
@@ -2031,10 +2031,10 @@
         </w:tblBorders>
       </w:tblPr>
       <w:tblGrid>
-        <w:gridCol w:w="1185"/>
-        <w:gridCol w:w="1936"/>
-        <w:gridCol w:w="2561"/>
-        <w:gridCol w:w="3318"/>
+        <w:gridCol w:w="1163"/>
+        <w:gridCol w:w="1900"/>
+        <w:gridCol w:w="2513"/>
+        <w:gridCol w:w="3424"/>
       </w:tblGrid>
       <w:tr>
         <w:trPr>
@@ -2043,7 +2043,7 @@
         </w:trPr>
         <w:tc>
           <w:tcPr>
-            <w:tcW w:type="dxa" w:w="1185"/>
+            <w:tcW w:type="dxa" w:w="1163"/>
             <w:tcBorders>
               <w:top w:val="single" w:color="000000" w:sz="12"/>
               <w:left w:val="none" w:color="FFFFFF" w:sz="0"/>
@@ -2078,7 +2078,7 @@
         </w:tc>
         <w:tc>
           <w:tcPr>
-            <w:tcW w:type="dxa" w:w="1936"/>
+            <w:tcW w:type="dxa" w:w="1900"/>
             <w:tcBorders>
               <w:top w:val="single" w:color="000000" w:sz="12"/>
               <w:left w:val="none" w:color="FFFFFF" w:sz="0"/>
@@ -2113,7 +2113,7 @@
         </w:tc>
         <w:tc>
           <w:tcPr>
-            <w:tcW w:type="dxa" w:w="2561"/>
+            <w:tcW w:type="dxa" w:w="2513"/>
             <w:tcBorders>
               <w:top w:val="single" w:color="000000" w:sz="12"/>
               <w:left w:val="none" w:color="FFFFFF" w:sz="0"/>
@@ -2148,7 +2148,7 @@
         </w:tc>
         <w:tc>
           <w:tcPr>
-            <w:tcW w:type="dxa" w:w="3318"/>
+            <w:tcW w:type="dxa" w:w="3424"/>
             <w:tcBorders>
               <w:top w:val="single" w:color="000000" w:sz="12"/>
               <w:left w:val="none" w:color="FFFFFF" w:sz="0"/>
@@ -2189,7 +2189,7 @@
         </w:trPr>
         <w:tc>
           <w:tcPr>
-            <w:tcW w:type="dxa" w:w="1185"/>
+            <w:tcW w:type="dxa" w:w="1163"/>
             <w:tcBorders>
               <w:top w:val="none" w:color="FFFFFF" w:sz="0"/>
               <w:left w:val="none" w:color="FFFFFF" w:sz="0"/>
@@ -2224,7 +2224,7 @@
         </w:tc>
         <w:tc>
           <w:tcPr>
-            <w:tcW w:type="dxa" w:w="1936"/>
+            <w:tcW w:type="dxa" w:w="1900"/>
             <w:tcBorders>
               <w:top w:val="none" w:color="FFFFFF" w:sz="0"/>
               <w:left w:val="none" w:color="FFFFFF" w:sz="0"/>
@@ -2259,7 +2259,7 @@
         </w:tc>
         <w:tc>
           <w:tcPr>
-            <w:tcW w:type="dxa" w:w="2561"/>
+            <w:tcW w:type="dxa" w:w="2513"/>
             <w:tcBorders>
               <w:top w:val="none" w:color="FFFFFF" w:sz="0"/>
               <w:left w:val="none" w:color="FFFFFF" w:sz="0"/>
@@ -2294,7 +2294,7 @@
         </w:tc>
         <w:tc>
           <w:tcPr>
-            <w:tcW w:type="dxa" w:w="3318"/>
+            <w:tcW w:type="dxa" w:w="3424"/>
             <w:tcBorders>
               <w:top w:val="none" w:color="FFFFFF" w:sz="0"/>
               <w:left w:val="none" w:color="FFFFFF" w:sz="0"/>
@@ -2335,7 +2335,7 @@
         </w:trPr>
         <w:tc>
           <w:tcPr>
-            <w:tcW w:type="dxa" w:w="1185"/>
+            <w:tcW w:type="dxa" w:w="1163"/>
             <w:tcBorders>
               <w:top w:val="none" w:color="FFFFFF" w:sz="0"/>
               <w:left w:val="none" w:color="FFFFFF" w:sz="0"/>
@@ -2370,7 +2370,7 @@
         </w:tc>
         <w:tc>
           <w:tcPr>
-            <w:tcW w:type="dxa" w:w="1936"/>
+            <w:tcW w:type="dxa" w:w="1900"/>
             <w:tcBorders>
               <w:top w:val="none" w:color="FFFFFF" w:sz="0"/>
               <w:left w:val="none" w:color="FFFFFF" w:sz="0"/>
@@ -2405,7 +2405,7 @@
         </w:tc>
         <w:tc>
           <w:tcPr>
-            <w:tcW w:type="dxa" w:w="2561"/>
+            <w:tcW w:type="dxa" w:w="2513"/>
             <w:tcBorders>
               <w:top w:val="none" w:color="FFFFFF" w:sz="0"/>
               <w:left w:val="none" w:color="FFFFFF" w:sz="0"/>
@@ -2440,7 +2440,7 @@
         </w:tc>
         <w:tc>
           <w:tcPr>
-            <w:tcW w:type="dxa" w:w="3318"/>
+            <w:tcW w:type="dxa" w:w="3424"/>
             <w:tcBorders>
               <w:top w:val="none" w:color="FFFFFF" w:sz="0"/>
               <w:left w:val="none" w:color="FFFFFF" w:sz="0"/>
@@ -2481,7 +2481,7 @@
         </w:trPr>
         <w:tc>
           <w:tcPr>
-            <w:tcW w:type="dxa" w:w="1185"/>
+            <w:tcW w:type="dxa" w:w="1163"/>
             <w:tcBorders>
               <w:top w:val="none" w:color="FFFFFF" w:sz="0"/>
               <w:left w:val="none" w:color="FFFFFF" w:sz="0"/>
@@ -2516,7 +2516,7 @@
         </w:tc>
         <w:tc>
           <w:tcPr>
-            <w:tcW w:type="dxa" w:w="1936"/>
+            <w:tcW w:type="dxa" w:w="1900"/>
             <w:tcBorders>
               <w:top w:val="none" w:color="FFFFFF" w:sz="0"/>
               <w:left w:val="none" w:color="FFFFFF" w:sz="0"/>
@@ -2551,7 +2551,7 @@
         </w:tc>
         <w:tc>
           <w:tcPr>
-            <w:tcW w:type="dxa" w:w="2561"/>
+            <w:tcW w:type="dxa" w:w="2513"/>
             <w:tcBorders>
               <w:top w:val="none" w:color="FFFFFF" w:sz="0"/>
               <w:left w:val="none" w:color="FFFFFF" w:sz="0"/>
@@ -2586,7 +2586,7 @@
         </w:tc>
         <w:tc>
           <w:tcPr>
-            <w:tcW w:type="dxa" w:w="3318"/>
+            <w:tcW w:type="dxa" w:w="3424"/>
             <w:tcBorders>
               <w:top w:val="none" w:color="FFFFFF" w:sz="0"/>
               <w:left w:val="none" w:color="FFFFFF" w:sz="0"/>
@@ -2627,7 +2627,7 @@
         </w:trPr>
         <w:tc>
           <w:tcPr>
-            <w:tcW w:type="dxa" w:w="1185"/>
+            <w:tcW w:type="dxa" w:w="1163"/>
             <w:tcBorders>
               <w:top w:val="none" w:color="FFFFFF" w:sz="0"/>
               <w:left w:val="none" w:color="FFFFFF" w:sz="0"/>
@@ -2662,7 +2662,7 @@
         </w:tc>
         <w:tc>
           <w:tcPr>
-            <w:tcW w:type="dxa" w:w="1936"/>
+            <w:tcW w:type="dxa" w:w="1900"/>
             <w:tcBorders>
               <w:top w:val="none" w:color="FFFFFF" w:sz="0"/>
               <w:left w:val="none" w:color="FFFFFF" w:sz="0"/>
@@ -2697,7 +2697,7 @@
         </w:tc>
         <w:tc>
           <w:tcPr>
-            <w:tcW w:type="dxa" w:w="2561"/>
+            <w:tcW w:type="dxa" w:w="2513"/>
             <w:tcBorders>
               <w:top w:val="none" w:color="FFFFFF" w:sz="0"/>
               <w:left w:val="none" w:color="FFFFFF" w:sz="0"/>
@@ -2732,7 +2732,7 @@
         </w:tc>
         <w:tc>
           <w:tcPr>
-            <w:tcW w:type="dxa" w:w="3318"/>
+            <w:tcW w:type="dxa" w:w="3424"/>
             <w:tcBorders>
               <w:top w:val="none" w:color="FFFFFF" w:sz="0"/>
               <w:left w:val="none" w:color="FFFFFF" w:sz="0"/>
@@ -2773,7 +2773,7 @@
         </w:trPr>
         <w:tc>
           <w:tcPr>
-            <w:tcW w:type="dxa" w:w="1185"/>
+            <w:tcW w:type="dxa" w:w="1163"/>
             <w:tcBorders>
               <w:top w:val="none" w:color="FFFFFF" w:sz="0"/>
               <w:left w:val="none" w:color="FFFFFF" w:sz="0"/>
@@ -2808,7 +2808,7 @@
         </w:tc>
         <w:tc>
           <w:tcPr>
-            <w:tcW w:type="dxa" w:w="1936"/>
+            <w:tcW w:type="dxa" w:w="1900"/>
             <w:tcBorders>
               <w:top w:val="none" w:color="FFFFFF" w:sz="0"/>
               <w:left w:val="none" w:color="FFFFFF" w:sz="0"/>
@@ -2843,7 +2843,7 @@
         </w:tc>
         <w:tc>
           <w:tcPr>
-            <w:tcW w:type="dxa" w:w="2561"/>
+            <w:tcW w:type="dxa" w:w="2513"/>
             <w:tcBorders>
               <w:top w:val="none" w:color="FFFFFF" w:sz="0"/>
               <w:left w:val="none" w:color="FFFFFF" w:sz="0"/>
@@ -2878,7 +2878,7 @@
         </w:tc>
         <w:tc>
           <w:tcPr>
-            <w:tcW w:type="dxa" w:w="3318"/>
+            <w:tcW w:type="dxa" w:w="3424"/>
             <w:tcBorders>
               <w:top w:val="none" w:color="FFFFFF" w:sz="0"/>
               <w:left w:val="none" w:color="FFFFFF" w:sz="0"/>
@@ -2919,7 +2919,7 @@
         </w:trPr>
         <w:tc>
           <w:tcPr>
-            <w:tcW w:type="dxa" w:w="1185"/>
+            <w:tcW w:type="dxa" w:w="1163"/>
             <w:tcBorders>
               <w:top w:val="none" w:color="FFFFFF" w:sz="0"/>
               <w:left w:val="none" w:color="FFFFFF" w:sz="0"/>
@@ -2954,7 +2954,7 @@
         </w:tc>
         <w:tc>
           <w:tcPr>
-            <w:tcW w:type="dxa" w:w="1936"/>
+            <w:tcW w:type="dxa" w:w="1900"/>
             <w:tcBorders>
               <w:top w:val="none" w:color="FFFFFF" w:sz="0"/>
               <w:left w:val="none" w:color="FFFFFF" w:sz="0"/>
@@ -2989,7 +2989,7 @@
         </w:tc>
         <w:tc>
           <w:tcPr>
-            <w:tcW w:type="dxa" w:w="2561"/>
+            <w:tcW w:type="dxa" w:w="2513"/>
             <w:tcBorders>
               <w:top w:val="none" w:color="FFFFFF" w:sz="0"/>
               <w:left w:val="none" w:color="FFFFFF" w:sz="0"/>
@@ -3024,7 +3024,7 @@
         </w:tc>
         <w:tc>
           <w:tcPr>
-            <w:tcW w:type="dxa" w:w="3318"/>
+            <w:tcW w:type="dxa" w:w="3424"/>
             <w:tcBorders>
               <w:top w:val="none" w:color="FFFFFF" w:sz="0"/>
               <w:left w:val="none" w:color="FFFFFF" w:sz="0"/>
@@ -3053,7 +3053,7 @@
                 <w:sz w:val="18"/>
                 <w:szCs w:val="18"/>
               </w:rPr>
-              <w:t xml:space="preserve">信源端内容可认定为广告；附购买入口的回答由平台作为发布者标识，不附购买入口的回答无标识义务主体</w:t>
+              <w:t xml:space="preserve">信源端内容可认定为广告；附购买入口并构成广告的回答由平台作为发布者标识；不附购买入口的回答无标识义务主体</w:t>
             </w:r>
           </w:p>
         </w:tc>
@@ -3079,7 +3079,7 @@
           <w:sz w:val="24"/>
           <w:szCs w:val="24"/>
         </w:rPr>
-        <w:t xml:space="preserve">4.3 理论基础：说服知识与“对模型中介的说服”</w:t>
+        <w:t xml:space="preserve">4.3 理论基础：说服知识与“经模型中介的说服”</w:t>
       </w:r>
     </w:p>
     <w:p>
@@ -3197,7 +3197,7 @@
           <w:sz w:val="24"/>
           <w:szCs w:val="24"/>
         </w:rPr>
-        <w:t xml:space="preserve">。本文据此提出一个命题：回答以中立助手的身份给出，用户把筛选信息的工作委托给了引擎，GEO的说服企图先作用于引擎的输入材料，再经由引擎的回答到达用户；用户面对的信息没有可辨认的说服者，说服知识缺少被激活的线索。本文将这一机制称为“对模型中介的说服”。说服对象从人转为模型，起作用的线索也随之改变。Stöckl和Nitu研究的是代人浏览网页、完成预订的AI代理，并非生成式引擎，但两者都由模型替用户筛选信息。他们在酒店与旅游预订场景中发现，AI代理既不忽视也不系统回避广告，而是偏好关键词以及价格、可订状态、规格等结构化数据；作者将其与人类消费者对照，指出后者可能受视觉线索、情感诉求和品牌信息左右</w:t>
+        <w:t xml:space="preserve">。本文据此提出一个命题：回答以中立助手的身份给出，用户把筛选信息的工作委托给了引擎，GEO的说服企图先作用于引擎的输入材料，再经由引擎的回答到达用户；用户面对的信息没有可辨认的说服者，说服知识缺少被激活的线索。本文将这一机制称为“经模型中介的说服”。直接的说服对象从人转为模型，最终受影响的仍是用户，起作用的线索也发生了变化。Stöckl和Nitu研究的是代人浏览网页、完成预订的AI代理，并非生成式引擎，但两者都由模型替用户筛选信息。他们在酒店与旅游预订场景中发现，AI代理既不忽视也不系统回避广告，而是偏好关键词以及价格、可订状态、规格等结构化数据；作者把这一点与人类用户对照，认为视觉线索和情感诉求更能左右人类用户</w:t>
       </w:r>
       <w:r>
         <w:rPr>
@@ -3218,7 +3218,7 @@
           <w:sz w:val="24"/>
           <w:szCs w:val="24"/>
         </w:rPr>
-        <w:t xml:space="preserve">。唐欣琳据此指出，广告创意工作的重心需要从视觉设计和情感表达转向具体产品信息的呈现</w:t>
+        <w:t xml:space="preserve">。唐欣琳由此指出，广告创意工作的重心需要从视觉设计和情感表达转向具体产品信息的呈现</w:t>
       </w:r>
       <w:r>
         <w:rPr>
@@ -3353,7 +3353,7 @@
           <w:sz w:val="24"/>
           <w:szCs w:val="24"/>
         </w:rPr>
-        <w:t xml:space="preserve">，都发生在这一环节。GEO服务采购的因此是第三方信源上的发布机会，而不是平台广告位。</w:t>
+        <w:t xml:space="preserve">，都发生在这一环节。GEO服务采购的因此主要是第三方信源上的发布机会。</w:t>
       </w:r>
     </w:p>
     <w:p>
@@ -3488,7 +3488,7 @@
           <w:sz w:val="24"/>
           <w:szCs w:val="24"/>
         </w:rPr>
-        <w:t xml:space="preserve">综合三个环节，现有研究中最稳定的影响因素是内容与查询的话题相关性和内容在上下文中的位置</w:t>
+        <w:t xml:space="preserve">综合三个环节，现有研究中最可靠的影响因素是内容与查询的话题相关性和内容在上下文中的位置</w:t>
       </w:r>
       <w:r>
         <w:rPr>
@@ -3530,7 +3530,7 @@
           <w:sz w:val="24"/>
           <w:szCs w:val="24"/>
         </w:rPr>
-        <w:t xml:space="preserve">。现有GEO实验没有检验创意表现和情感诉求的作用。结合4.3节所述Stöckl和Nitu的发现，本文提出一个可供检验的假设：在生成式引擎中，结构化产品信息对内容被采纳概率的影响大于创意表现和情感诉求。</w:t>
+        <w:t xml:space="preserve">。本文所引的GEO实验均未把创意表现和情感诉求作为变量加以检验。结合4.3节所述Stöckl和Nitu的发现，本文提出一个可供检验的假设：在生成式引擎中，结构化产品信息对内容被采纳概率的影响大于创意表现和情感诉求。</w:t>
       </w:r>
     </w:p>
     <w:p>
@@ -3825,28 +3825,49 @@
           <w:sz w:val="24"/>
           <w:szCs w:val="24"/>
         </w:rPr>
-        <w:t xml:space="preserve">两条路径之间存在张力。平台广告的商业价值建立在用户相信回答独立于广告的基础上，OpenAI和Perplexity都就此作出了公开承诺</w:t>
-      </w:r>
-      <w:r>
-        <w:rPr>
-          <w:rFonts w:ascii="Times New Roman" w:cs="Times New Roman" w:eastAsia="宋体" w:hAnsi="Times New Roman"/>
-          <w:b w:val="false"/>
-          <w:bCs w:val="false"/>
-          <w:sz w:val="24"/>
-          <w:szCs w:val="24"/>
-          <w:vertAlign w:val="superscript"/>
-        </w:rPr>
-        <w:t xml:space="preserve">[5,8]</w:t>
-      </w:r>
-      <w:r>
-        <w:rPr>
-          <w:rFonts w:ascii="Times New Roman" w:cs="Times New Roman" w:eastAsia="宋体" w:hAnsi="Times New Roman"/>
-          <w:b w:val="false"/>
-          <w:bCs w:val="false"/>
-          <w:sz w:val="24"/>
-          <w:szCs w:val="24"/>
-        </w:rPr>
-        <w:t xml:space="preserve">；Perplexity退出广告业务时，给出的理由正是广告会损害用户对回答的信任</w:t>
+        <w:t xml:space="preserve">两条路径之间存在张力。平台广告的商业价值建立在用户相信回答独立于广告的基础上：OpenAI承诺广告不影响ChatGPT的回答</w:t>
+      </w:r>
+      <w:r>
+        <w:rPr>
+          <w:rFonts w:ascii="Times New Roman" w:cs="Times New Roman" w:eastAsia="宋体" w:hAnsi="Times New Roman"/>
+          <w:b w:val="false"/>
+          <w:bCs w:val="false"/>
+          <w:sz w:val="24"/>
+          <w:szCs w:val="24"/>
+          <w:vertAlign w:val="superscript"/>
+        </w:rPr>
+        <w:t xml:space="preserve">[8]</w:t>
+      </w:r>
+      <w:r>
+        <w:rPr>
+          <w:rFonts w:ascii="Times New Roman" w:cs="Times New Roman" w:eastAsia="宋体" w:hAnsi="Times New Roman"/>
+          <w:b w:val="false"/>
+          <w:bCs w:val="false"/>
+          <w:sz w:val="24"/>
+          <w:szCs w:val="24"/>
+        </w:rPr>
+        <w:t xml:space="preserve">，Perplexity承诺赞助追问的回答由其系统生成、品牌不能撰写或编辑</w:t>
+      </w:r>
+      <w:r>
+        <w:rPr>
+          <w:rFonts w:ascii="Times New Roman" w:cs="Times New Roman" w:eastAsia="宋体" w:hAnsi="Times New Roman"/>
+          <w:b w:val="false"/>
+          <w:bCs w:val="false"/>
+          <w:sz w:val="24"/>
+          <w:szCs w:val="24"/>
+          <w:vertAlign w:val="superscript"/>
+        </w:rPr>
+        <w:t xml:space="preserve">[5]</w:t>
+      </w:r>
+      <w:r>
+        <w:rPr>
+          <w:rFonts w:ascii="Times New Roman" w:cs="Times New Roman" w:eastAsia="宋体" w:hAnsi="Times New Roman"/>
+          <w:b w:val="false"/>
+          <w:bCs w:val="false"/>
+          <w:sz w:val="24"/>
+          <w:szCs w:val="24"/>
+        </w:rPr>
+        <w:t xml:space="preserve">；Perplexity逐步退出广告业务时，给出的理由正是广告会损害用户对回答的信任</w:t>
       </w:r>
       <w:r>
         <w:rPr>
@@ -3867,7 +3888,7 @@
           <w:sz w:val="24"/>
           <w:szCs w:val="24"/>
         </w:rPr>
-        <w:t xml:space="preserve">；百度管理层也表示，AI搜索当前优先保证回答质量和用户体验，有意推迟其商业化</w:t>
+        <w:t xml:space="preserve">；百度管理层也表示，AI搜索当前优先改善回答质量和用户体验，有意推迟其商业化</w:t>
       </w:r>
       <w:r>
         <w:rPr>
@@ -3888,7 +3909,7 @@
           <w:sz w:val="24"/>
           <w:szCs w:val="24"/>
         </w:rPr>
-        <w:t xml:space="preserve">。第三方GEO的价值来自影响回答，平台若不加约束，就会损及自己作出的回答独立性承诺，7.3节据此讨论平台的义务。</w:t>
+        <w:t xml:space="preserve">。这些承诺的字面范围只及于平台自身的广告，第三方GEO不在其内；但第三方GEO的价值正来自影响回答，平台若不加约束，承诺所要维护的用户信任同样会受损，7.3节讨论平台的相应义务。</w:t>
       </w:r>
     </w:p>
     <w:p>
@@ -3922,10 +3943,10 @@
         </w:tblBorders>
       </w:tblPr>
       <w:tblGrid>
-        <w:gridCol w:w="1206"/>
-        <w:gridCol w:w="3074"/>
-        <w:gridCol w:w="2411"/>
-        <w:gridCol w:w="2309"/>
+        <w:gridCol w:w="1193"/>
+        <w:gridCol w:w="3040"/>
+        <w:gridCol w:w="2483"/>
+        <w:gridCol w:w="2284"/>
       </w:tblGrid>
       <w:tr>
         <w:trPr>
@@ -3934,7 +3955,7 @@
         </w:trPr>
         <w:tc>
           <w:tcPr>
-            <w:tcW w:type="dxa" w:w="1206"/>
+            <w:tcW w:type="dxa" w:w="1193"/>
             <w:tcBorders>
               <w:top w:val="single" w:color="000000" w:sz="12"/>
               <w:left w:val="none" w:color="FFFFFF" w:sz="0"/>
@@ -3969,7 +3990,7 @@
         </w:tc>
         <w:tc>
           <w:tcPr>
-            <w:tcW w:type="dxa" w:w="3074"/>
+            <w:tcW w:type="dxa" w:w="3040"/>
             <w:tcBorders>
               <w:top w:val="single" w:color="000000" w:sz="12"/>
               <w:left w:val="none" w:color="FFFFFF" w:sz="0"/>
@@ -4004,7 +4025,7 @@
         </w:tc>
         <w:tc>
           <w:tcPr>
-            <w:tcW w:type="dxa" w:w="2411"/>
+            <w:tcW w:type="dxa" w:w="2483"/>
             <w:tcBorders>
               <w:top w:val="single" w:color="000000" w:sz="12"/>
               <w:left w:val="none" w:color="FFFFFF" w:sz="0"/>
@@ -4039,7 +4060,7 @@
         </w:tc>
         <w:tc>
           <w:tcPr>
-            <w:tcW w:type="dxa" w:w="2309"/>
+            <w:tcW w:type="dxa" w:w="2284"/>
             <w:tcBorders>
               <w:top w:val="single" w:color="000000" w:sz="12"/>
               <w:left w:val="none" w:color="FFFFFF" w:sz="0"/>
@@ -4080,7 +4101,7 @@
         </w:trPr>
         <w:tc>
           <w:tcPr>
-            <w:tcW w:type="dxa" w:w="1206"/>
+            <w:tcW w:type="dxa" w:w="1193"/>
             <w:tcBorders>
               <w:top w:val="none" w:color="FFFFFF" w:sz="0"/>
               <w:left w:val="none" w:color="FFFFFF" w:sz="0"/>
@@ -4115,7 +4136,7 @@
         </w:tc>
         <w:tc>
           <w:tcPr>
-            <w:tcW w:type="dxa" w:w="3074"/>
+            <w:tcW w:type="dxa" w:w="3040"/>
             <w:tcBorders>
               <w:top w:val="none" w:color="FFFFFF" w:sz="0"/>
               <w:left w:val="none" w:color="FFFFFF" w:sz="0"/>
@@ -4150,7 +4171,7 @@
         </w:tc>
         <w:tc>
           <w:tcPr>
-            <w:tcW w:type="dxa" w:w="2411"/>
+            <w:tcW w:type="dxa" w:w="2483"/>
             <w:tcBorders>
               <w:top w:val="none" w:color="FFFFFF" w:sz="0"/>
               <w:left w:val="none" w:color="FFFFFF" w:sz="0"/>
@@ -4185,7 +4206,7 @@
         </w:tc>
         <w:tc>
           <w:tcPr>
-            <w:tcW w:type="dxa" w:w="2309"/>
+            <w:tcW w:type="dxa" w:w="2284"/>
             <w:tcBorders>
               <w:top w:val="none" w:color="FFFFFF" w:sz="0"/>
               <w:left w:val="none" w:color="FFFFFF" w:sz="0"/>
@@ -4214,7 +4235,7 @@
                 <w:sz w:val="18"/>
                 <w:szCs w:val="18"/>
               </w:rPr>
-              <w:t xml:space="preserve">GEO服务商或其他第三方</w:t>
+              <w:t xml:space="preserve">广告主自行或委托GEO服务商，或其他第三方</w:t>
             </w:r>
           </w:p>
         </w:tc>
@@ -4226,7 +4247,7 @@
         </w:trPr>
         <w:tc>
           <w:tcPr>
-            <w:tcW w:type="dxa" w:w="1206"/>
+            <w:tcW w:type="dxa" w:w="1193"/>
             <w:tcBorders>
               <w:top w:val="none" w:color="FFFFFF" w:sz="0"/>
               <w:left w:val="none" w:color="FFFFFF" w:sz="0"/>
@@ -4261,7 +4282,7 @@
         </w:tc>
         <w:tc>
           <w:tcPr>
-            <w:tcW w:type="dxa" w:w="3074"/>
+            <w:tcW w:type="dxa" w:w="3040"/>
             <w:tcBorders>
               <w:top w:val="none" w:color="FFFFFF" w:sz="0"/>
               <w:left w:val="none" w:color="FFFFFF" w:sz="0"/>
@@ -4296,7 +4317,7 @@
         </w:tc>
         <w:tc>
           <w:tcPr>
-            <w:tcW w:type="dxa" w:w="2411"/>
+            <w:tcW w:type="dxa" w:w="2483"/>
             <w:tcBorders>
               <w:top w:val="none" w:color="FFFFFF" w:sz="0"/>
               <w:left w:val="none" w:color="FFFFFF" w:sz="0"/>
@@ -4331,7 +4352,7 @@
         </w:tc>
         <w:tc>
           <w:tcPr>
-            <w:tcW w:type="dxa" w:w="2309"/>
+            <w:tcW w:type="dxa" w:w="2284"/>
             <w:tcBorders>
               <w:top w:val="none" w:color="FFFFFF" w:sz="0"/>
               <w:left w:val="none" w:color="FFFFFF" w:sz="0"/>
@@ -4372,7 +4393,7 @@
         </w:trPr>
         <w:tc>
           <w:tcPr>
-            <w:tcW w:type="dxa" w:w="1206"/>
+            <w:tcW w:type="dxa" w:w="1193"/>
             <w:tcBorders>
               <w:top w:val="none" w:color="FFFFFF" w:sz="0"/>
               <w:left w:val="none" w:color="FFFFFF" w:sz="0"/>
@@ -4407,7 +4428,7 @@
         </w:tc>
         <w:tc>
           <w:tcPr>
-            <w:tcW w:type="dxa" w:w="3074"/>
+            <w:tcW w:type="dxa" w:w="3040"/>
             <w:tcBorders>
               <w:top w:val="none" w:color="FFFFFF" w:sz="0"/>
               <w:left w:val="none" w:color="FFFFFF" w:sz="0"/>
@@ -4442,7 +4463,7 @@
         </w:tc>
         <w:tc>
           <w:tcPr>
-            <w:tcW w:type="dxa" w:w="2411"/>
+            <w:tcW w:type="dxa" w:w="2483"/>
             <w:tcBorders>
               <w:top w:val="none" w:color="FFFFFF" w:sz="0"/>
               <w:left w:val="none" w:color="FFFFFF" w:sz="0"/>
@@ -4477,7 +4498,7 @@
         </w:tc>
         <w:tc>
           <w:tcPr>
-            <w:tcW w:type="dxa" w:w="2309"/>
+            <w:tcW w:type="dxa" w:w="2284"/>
             <w:tcBorders>
               <w:top w:val="none" w:color="FFFFFF" w:sz="0"/>
               <w:left w:val="none" w:color="FFFFFF" w:sz="0"/>
@@ -4518,7 +4539,7 @@
         </w:trPr>
         <w:tc>
           <w:tcPr>
-            <w:tcW w:type="dxa" w:w="1206"/>
+            <w:tcW w:type="dxa" w:w="1193"/>
             <w:tcBorders>
               <w:top w:val="none" w:color="FFFFFF" w:sz="0"/>
               <w:left w:val="none" w:color="FFFFFF" w:sz="0"/>
@@ -4553,7 +4574,7 @@
         </w:tc>
         <w:tc>
           <w:tcPr>
-            <w:tcW w:type="dxa" w:w="3074"/>
+            <w:tcW w:type="dxa" w:w="3040"/>
             <w:tcBorders>
               <w:top w:val="none" w:color="FFFFFF" w:sz="0"/>
               <w:left w:val="none" w:color="FFFFFF" w:sz="0"/>
@@ -4588,7 +4609,7 @@
         </w:tc>
         <w:tc>
           <w:tcPr>
-            <w:tcW w:type="dxa" w:w="2411"/>
+            <w:tcW w:type="dxa" w:w="2483"/>
             <w:tcBorders>
               <w:top w:val="none" w:color="FFFFFF" w:sz="0"/>
               <w:left w:val="none" w:color="FFFFFF" w:sz="0"/>
@@ -4623,7 +4644,7 @@
         </w:tc>
         <w:tc>
           <w:tcPr>
-            <w:tcW w:type="dxa" w:w="2309"/>
+            <w:tcW w:type="dxa" w:w="2284"/>
             <w:tcBorders>
               <w:top w:val="none" w:color="FFFFFF" w:sz="0"/>
               <w:left w:val="none" w:color="FFFFFF" w:sz="0"/>
@@ -4664,7 +4685,7 @@
         </w:trPr>
         <w:tc>
           <w:tcPr>
-            <w:tcW w:type="dxa" w:w="1206"/>
+            <w:tcW w:type="dxa" w:w="1193"/>
             <w:tcBorders>
               <w:top w:val="none" w:color="FFFFFF" w:sz="0"/>
               <w:left w:val="none" w:color="FFFFFF" w:sz="0"/>
@@ -4699,7 +4720,7 @@
         </w:tc>
         <w:tc>
           <w:tcPr>
-            <w:tcW w:type="dxa" w:w="3074"/>
+            <w:tcW w:type="dxa" w:w="3040"/>
             <w:tcBorders>
               <w:top w:val="none" w:color="FFFFFF" w:sz="0"/>
               <w:left w:val="none" w:color="FFFFFF" w:sz="0"/>
@@ -4734,7 +4755,7 @@
         </w:tc>
         <w:tc>
           <w:tcPr>
-            <w:tcW w:type="dxa" w:w="2411"/>
+            <w:tcW w:type="dxa" w:w="2483"/>
             <w:tcBorders>
               <w:top w:val="none" w:color="FFFFFF" w:sz="0"/>
               <w:left w:val="none" w:color="FFFFFF" w:sz="0"/>
@@ -4763,13 +4784,13 @@
                 <w:sz w:val="18"/>
                 <w:szCs w:val="18"/>
               </w:rPr>
-              <w:t xml:space="preserve">服务商与内容渠道</w:t>
+              <w:t xml:space="preserve">委托实施时归服务商与内容渠道；自行发布的无第三方收入</w:t>
             </w:r>
           </w:p>
         </w:tc>
         <w:tc>
           <w:tcPr>
-            <w:tcW w:type="dxa" w:w="2309"/>
+            <w:tcW w:type="dxa" w:w="2284"/>
             <w:tcBorders>
               <w:top w:val="none" w:color="FFFFFF" w:sz="0"/>
               <w:left w:val="none" w:color="FFFFFF" w:sz="0"/>
@@ -4798,7 +4819,7 @@
                 <w:sz w:val="18"/>
                 <w:szCs w:val="18"/>
               </w:rPr>
-              <w:t xml:space="preserve">服务商与内容渠道</w:t>
+              <w:t xml:space="preserve">委托实施时归服务商与内容渠道</w:t>
             </w:r>
           </w:p>
         </w:tc>
@@ -4810,7 +4831,7 @@
         </w:trPr>
         <w:tc>
           <w:tcPr>
-            <w:tcW w:type="dxa" w:w="1206"/>
+            <w:tcW w:type="dxa" w:w="1193"/>
             <w:tcBorders>
               <w:top w:val="none" w:color="FFFFFF" w:sz="0"/>
               <w:left w:val="none" w:color="FFFFFF" w:sz="0"/>
@@ -4845,7 +4866,7 @@
         </w:tc>
         <w:tc>
           <w:tcPr>
-            <w:tcW w:type="dxa" w:w="3074"/>
+            <w:tcW w:type="dxa" w:w="3040"/>
             <w:tcBorders>
               <w:top w:val="none" w:color="FFFFFF" w:sz="0"/>
               <w:left w:val="none" w:color="FFFFFF" w:sz="0"/>
@@ -4880,7 +4901,7 @@
         </w:tc>
         <w:tc>
           <w:tcPr>
-            <w:tcW w:type="dxa" w:w="2411"/>
+            <w:tcW w:type="dxa" w:w="2483"/>
             <w:tcBorders>
               <w:top w:val="none" w:color="FFFFFF" w:sz="0"/>
               <w:left w:val="none" w:color="FFFFFF" w:sz="0"/>
@@ -4915,7 +4936,7 @@
         </w:tc>
         <w:tc>
           <w:tcPr>
-            <w:tcW w:type="dxa" w:w="2309"/>
+            <w:tcW w:type="dxa" w:w="2284"/>
             <w:tcBorders>
               <w:top w:val="none" w:color="FFFFFF" w:sz="0"/>
               <w:left w:val="none" w:color="FFFFFF" w:sz="0"/>
@@ -5004,7 +5025,7 @@
           <w:sz w:val="24"/>
           <w:szCs w:val="24"/>
         </w:rPr>
-        <w:t xml:space="preserve">按照4.3节的命题，GEO内容在回答中不带标识，用户的说服知识就无从激活。问题在于，现行规则能否要求某个主体为这些内容加上标识。表3按规范对象、相关规定和适用环节比对了10部规范文本。</w:t>
+        <w:t xml:space="preserve">按照4.3节的命题，GEO内容在回答中不带标识，用户的说服知识就缺少被激活的线索。问题在于，现行规则能否要求某个主体为这些内容加上标识。表3按规范对象、相关规定和适用环节比对了10部规范文本。</w:t>
       </w:r>
     </w:p>
     <w:p>
@@ -5874,7 +5895,7 @@
                 <w:sz w:val="18"/>
                 <w:szCs w:val="18"/>
               </w:rPr>
-              <w:t xml:space="preserve">付费搜索广告与自然搜索结果明显区分</w:t>
+              <w:t xml:space="preserve">第七条：互联网广告应具有可识别性、显著标明“广告”；付费搜索广告与自然搜索结果明显区分</w:t>
             </w:r>
           </w:p>
         </w:tc>
@@ -5909,7 +5930,7 @@
                 <w:sz w:val="18"/>
                 <w:szCs w:val="18"/>
               </w:rPr>
-              <w:t xml:space="preserve">仅涉及付费搜索</w:t>
+              <w:t xml:space="preserve">已废止，可识别性要求由2023年办法第九条承继</w:t>
             </w:r>
           </w:p>
         </w:tc>
@@ -7119,7 +7140,7 @@
           <w:sz w:val="24"/>
           <w:szCs w:val="24"/>
         </w:rPr>
-        <w:t xml:space="preserve">。以推销为目的投放到第三方信源的GEO内容，在这一环节可以认定为广告，发布者负有使其具有可识别性的义务。品牌在自建网站和自有账号上发布的内容同样是广告，属于广告主自行发布</w:t>
+        <w:t xml:space="preserve">。以推销为目的投放到第三方信源的GEO内容，在这一环节可以认定为广告，发布者负有使其具有可识别性的义务。品牌在自建网站和自有账号上推销自身商品或者服务的内容构成广告的，属于广告主自行发布，《互联网广告管理办法》第十三条允许广告主通过自建网站以及自有的客户端、互联网应用程序、公众号、网络店铺页面等自行发布广告</w:t>
       </w:r>
       <w:r>
         <w:rPr>
@@ -7203,7 +7224,7 @@
           <w:sz w:val="24"/>
           <w:szCs w:val="24"/>
         </w:rPr>
-        <w:t xml:space="preserve">。以矩阵账号海量投放的GEO内容，面对的是一个威慑有限的责任结构。</w:t>
+        <w:t xml:space="preserve">。对以矩阵账号海量投放GEO内容的行为，这一罚则的威慑有限。</w:t>
       </w:r>
     </w:p>
     <w:p>
@@ -7241,7 +7262,7 @@
           <w:sz w:val="24"/>
           <w:szCs w:val="24"/>
         </w:rPr>
-        <w:t xml:space="preserve">；《互联网广告管理办法》第九条第三款要求附加购物链接的推销内容显著标明“广告”</w:t>
+        <w:t xml:space="preserve">；《互联网广告管理办法》第九条第三款要求，以知识介绍、体验分享、消费测评等形式推销商品或者服务并附加购物链接等购买方式的，广告发布者应当显著标明“广告”</w:t>
       </w:r>
       <w:r>
         <w:rPr>
@@ -7283,7 +7304,7 @@
           <w:sz w:val="24"/>
           <w:szCs w:val="24"/>
         </w:rPr>
-        <w:t xml:space="preserve">，这类回答构成广告的，平台即为广告发布者，标识义务有明确的承担者。缺口存在于不附购买入口、平台也未就该内容收取对价的回答。在这类回答中，回答由平台的模型自动生成，平台并未受广告主或者广告经营者委托发布该内容，介绍的也不是自己所推销的商品，不符合《广告法》第二条对广告主和广告发布者的界定</w:t>
+        <w:t xml:space="preserve">，这类回答构成广告的，平台即为广告发布者，标识义务有明确的承担者。缺口存在于平台既未附加购买入口、未就相关内容收取对价，也未以人工或算法干预其排序和展示的回答，下文简称“不附购买入口的回答”。在这类回答中，回答由平台的模型自动生成，平台并未受广告主或者广告经营者委托发布该内容，介绍的也不是自己所推销的商品，不符合《广告法》第二条对广告主和广告发布者的界定</w:t>
       </w:r>
       <w:r>
         <w:rPr>
@@ -7426,7 +7447,7 @@
           <w:sz w:val="24"/>
           <w:szCs w:val="24"/>
         </w:rPr>
-        <w:t xml:space="preserve">。这些规定与GEO之间有三处断裂：制止和处置义务以平台明知、应知或发现违法内容为前提，而平台通常无从得知某一信源是付费内容；GEO投放者并不直接利用引擎的信息服务发布内容，内容是由引擎检索抓取的；义务内容是删除、屏蔽和整改，不是向用户标示商业属性。回答环节缺少的是标识义务，而不是平台责任的全部。</w:t>
+        <w:t xml:space="preserve">。这些规定与GEO之间有三处断裂：制止和处置义务以平台明知、应知或发现违法内容为前提，而平台仅凭信源内容无从判断其是否付费（见本节末段Schmidt等的发现）；GEO投放者并不直接利用引擎的信息服务发布内容，内容是由引擎检索抓取的；义务内容是删除、屏蔽和整改，不是向用户标示商业属性。因此，平台在回答环节负有制止和处置义务，但不负标识义务。</w:t>
       </w:r>
     </w:p>
     <w:p>
@@ -7443,7 +7464,7 @@
           <w:sz w:val="24"/>
           <w:szCs w:val="24"/>
         </w:rPr>
-        <w:t xml:space="preserve">AI内容标识规则同样填补不了这一缺口。《生成式人工智能服务管理暂行办法》要求提供者按照深度合成管理规定对生成内容进行标识</w:t>
+        <w:t xml:space="preserve">AI内容标识规则同样填补不了这一缺口。《生成式人工智能服务管理暂行办法》第十二条要求提供者按照《互联网信息服务深度合成管理规定》对图片、视频等生成内容进行标识</w:t>
       </w:r>
       <w:r>
         <w:rPr>
@@ -7540,7 +7561,7 @@
           <w:sz w:val="24"/>
           <w:szCs w:val="24"/>
         </w:rPr>
-        <w:t xml:space="preserve">GEO与操纵之间的差别可以沿两个维度描述。一是内容是否真实：从补充统计数据和引语的内容改写</w:t>
+        <w:t xml:space="preserve">信息型GEO与操纵型GEO之间的差别可以沿两个维度描述。一是内容是否真实：从补充统计数据和引语的内容改写</w:t>
       </w:r>
       <w:r>
         <w:rPr>
@@ -7683,7 +7704,7 @@
           <w:sz w:val="24"/>
           <w:szCs w:val="24"/>
         </w:rPr>
-        <w:t xml:space="preserve">，说明在国内主流大模型上制造虚假推荐的门槛已经很低。由于引用标注本身不能作为回答可信的依据</w:t>
+        <w:t xml:space="preserve">，说明借助在电商平台即可购得的GEO软件，就能让国内主流大模型推荐一款并不存在的产品。由于引用标注本身不能作为回答可信的依据</w:t>
       </w:r>
       <w:r>
         <w:rPr>
@@ -7742,7 +7763,7 @@
           <w:sz w:val="24"/>
           <w:szCs w:val="24"/>
         </w:rPr>
-        <w:t xml:space="preserve">按7.1节的标准，受托投放的GEO内容本身是广告，操纵型GEO首先受《广告法》虚假广告规则约束。第二十八条把“商品或者服务不存在的”“使用虚构、伪造或者无法验证的科研成果、统计资料、调查结果、文摘、引用语等信息作证明材料的”“虚构使用商品或者接受服务的效果的”列为虚假广告，第十一条要求广告使用的数据、统计资料、调查结果、引用语等引证内容真实、准确并表明出处</w:t>
+        <w:t xml:space="preserve">按6.1节的分析，以推销为目的投放的GEO内容本身是广告（认定标准见7.1节），操纵型GEO因此首先受《广告法》虚假广告规则约束。第二十八条把“商品或者服务不存在的”“使用虚构、伪造或者无法验证的科研成果、统计资料、调查结果、文摘、引用语等信息作证明材料的”“虚构使用商品或者接受服务的效果的”列为虚假广告，第十一条要求广告使用的数据、统计资料、调查结果、引用语等引证内容真实、准确并表明出处</w:t>
       </w:r>
       <w:r>
         <w:rPr>
@@ -7805,7 +7826,7 @@
           <w:sz w:val="24"/>
           <w:szCs w:val="24"/>
         </w:rPr>
-        <w:t xml:space="preserve">。以矩阵账号批量发布的，还违反《网络信息内容生态治理规定》第二十四条关于不得通过人工方式或者技术手段实施流量造假、虚假注册账号、操纵用户账号的规定</w:t>
+        <w:t xml:space="preserve">。以虚假注册或者被操纵的矩阵账号批量发布、制造虚假流量的，还违反《网络信息内容生态治理规定》第二十四条关于不得通过人工方式或者技术手段实施流量造假、虚假注册账号、操纵用户账号的规定</w:t>
       </w:r>
       <w:r>
         <w:rPr>
@@ -7826,7 +7847,7 @@
           <w:sz w:val="24"/>
           <w:szCs w:val="24"/>
         </w:rPr>
-        <w:t xml:space="preserve">；编造用户评价的，另受《电子商务法》第十七条约束</w:t>
+        <w:t xml:space="preserve">；电子商务经营者编造用户评价的，另受《电子商务法》第十七条约束</w:t>
       </w:r>
       <w:r>
         <w:rPr>
@@ -7906,7 +7927,7 @@
           <w:sz w:val="24"/>
           <w:szCs w:val="24"/>
         </w:rPr>
-        <w:t xml:space="preserve">，引擎经营者可以据此追究以提示注入操纵回答的行为，但这一路径依赖引擎经营者主张权利，不能替代面向用户的标识。《互联网信息服务算法推荐管理规定》第十四条禁止算法推荐服务提供者利用算法操纵榜单或者检索结果排序、控制热搜或者精选等干预信息呈现，实施影响网络舆论或者规避监督管理的行为</w:t>
+        <w:t xml:space="preserve">，引擎经营者可以依该条追究以提示注入操纵回答的行为，但这一路径依赖引擎经营者主张权利，不能替代面向用户的标识。《互联网信息服务算法推荐管理规定》第十四条禁止算法推荐服务提供者利用算法操纵榜单或者检索结果排序、控制热搜或者精选等干预信息呈现，实施影响网络舆论或者规避监督管理的行为</w:t>
       </w:r>
       <w:r>
         <w:rPr>
@@ -8003,7 +8024,7 @@
           <w:sz w:val="24"/>
           <w:szCs w:val="24"/>
         </w:rPr>
-        <w:t xml:space="preserve">，依靠第三方报道的GEO路径对已有媒体声量的品牌更有利。缺少这类资源的经营者如果以批量生成内容替代第三方报道，就进入了“3·15”晚会和相关报道所揭示的虚假评测、伪造评价路径</w:t>
+        <w:t xml:space="preserve">，依靠第三方报道的GEO路径对已有媒体声量的品牌更有利。缺少这类资源的经营者如果以批量生成的虚构测评和评价替代第三方报道，就进入了“3·15”晚会和相关报道所揭示的路径</w:t>
       </w:r>
       <w:r>
         <w:rPr>
@@ -8045,7 +8066,7 @@
           <w:sz w:val="24"/>
           <w:szCs w:val="24"/>
         </w:rPr>
-        <w:t xml:space="preserve">，广告主为维持原有可见度需要持续投入。操纵型GEO还会带来社会成本：Nestaas等指出，每个参与方都有动机发起偏好操纵攻击，而所有人都攻击时，模型的输出质量整体下降</w:t>
+        <w:t xml:space="preserve">，广告主为维持原有可见度需要持续投入。操纵型GEO还会带来6.2节所述的囚徒困境式社会成本</w:t>
       </w:r>
       <w:r>
         <w:rPr>
@@ -8142,7 +8163,7 @@
           <w:sz w:val="24"/>
           <w:szCs w:val="24"/>
         </w:rPr>
-        <w:t xml:space="preserve">，广告主可以据此把关键词出价与销售回报直接关联</w:t>
+        <w:t xml:space="preserve">，广告主可以据此把关键词出价与投放绩效直接关联</w:t>
       </w:r>
       <w:r>
         <w:rPr>
@@ -8226,7 +8247,7 @@
           <w:sz w:val="24"/>
           <w:szCs w:val="24"/>
         </w:rPr>
-        <w:t xml:space="preserve">，Perplexity在2024年11月开始测试广告、2026年2月宣布逐步退出广告业务</w:t>
+        <w:t xml:space="preserve">，Perplexity在2024年11月开始测试广告、2026年2月开始逐步退出广告业务</w:t>
       </w:r>
       <w:r>
         <w:rPr>
@@ -8264,7 +8285,7 @@
           <w:sz w:val="24"/>
           <w:szCs w:val="24"/>
         </w:rPr>
-        <w:t xml:space="preserve">GEO的度量问题更为突出。它的效果体现为品牌在回答中的被提及率与提及位置，而生成式回答具有随机性。Martinez指出，商业审计中不同次运行之间引用来源的重叠度低、波动大，其综述的研究中没有一种GEO技术在跨平台的自然可发现性上显示出稳定效果</w:t>
+        <w:t xml:space="preserve">GEO的度量问题更为突出。它的效果体现为品牌在回答中的被提及率与提及位置，而生成式回答具有随机性。Martinez指出，商业审计显示引用来源的重叠度低，不同次运行之间的结果波动大，其综述的研究中没有一种GEO技术在跨平台的自然可发现性上显示出稳定效果</w:t>
       </w:r>
       <w:r>
         <w:rPr>
@@ -8357,7 +8378,7 @@
           <w:sz w:val="24"/>
           <w:szCs w:val="24"/>
         </w:rPr>
-        <w:t xml:space="preserve">GEO内容的广告属性应按《广告法》第二条认定：内容由商品经营者或者服务提供者自行或者委托他人制作和分发，以直接或者间接推销其商品或者服务为目的，即构成商业广告，发布在品牌自有网站还是第三方信源不影响认定</w:t>
+        <w:t xml:space="preserve">GEO内容的广告属性应按《广告法》第二条认定：商品经营者或者服务提供者通过一定媒介和形式直接或者间接地介绍自己所推销的商品或者服务的，属于商业广告活动；为推销商品或者服务，自行或者委托他人设计、制作、发布广告的，为广告主</w:t>
       </w:r>
       <w:r>
         <w:rPr>
@@ -8378,7 +8399,7 @@
           <w:sz w:val="24"/>
           <w:szCs w:val="24"/>
         </w:rPr>
-        <w:t xml:space="preserve">。广告主向服务商或内容渠道支付对价，是证明推销目的的主要证据，不是认定的前提条件。这一标准与正常的公关传播可以区分：媒体在未收取对价、保有编辑决定权的情况下独立撰写的报道，不构成广告；由服务商代为联络、但是否报道以及如何报道都由媒体独立决定的内容，属于公关传播，不在信息型GEO之列；媒体收取对价或让渡编辑决定权的，按付费内容认定。向内容渠道付费发布的测评、榜单和资讯，以非广告的形式承载推销内容，与《广告法》第十四条禁止的大众传播媒介以新闻报道形式变相发布广告属于同一类可识别性问题</w:t>
+        <w:t xml:space="preserve">。该条对“一定媒介和形式”不作限定，GEO内容发布在品牌自有网站还是第三方信源，不影响认定。广告主向服务商或内容渠道支付对价，是证明推销目的的主要证据，不是认定的前提条件。这一标准与正常的公关传播可以区分：媒体在未收取对价、保有编辑决定权的情况下独立撰写的报道，不构成广告；由服务商代为联络、但是否报道以及如何报道都由媒体独立决定的内容，属于公关传播，不在信息型GEO之列；媒体收取对价或让渡编辑决定权的，按付费内容认定。向内容渠道付费发布的测评、榜单和资讯，以非广告的形式承载推销内容，与《广告法》第十四条禁止的大众传播媒介以新闻报道形式变相发布广告属于同一类可识别性问题</w:t>
       </w:r>
       <w:r>
         <w:rPr>
@@ -8437,7 +8458,7 @@
           <w:sz w:val="24"/>
           <w:szCs w:val="24"/>
         </w:rPr>
-        <w:t xml:space="preserve">针对6.1节所述不附购买入口的回答中的缺口，建议分两层处理。第一层在《互联网广告管理办法》中明确主体认定：委托他人制作、分发内容以影响生成式人工智能输出、推销商品或者服务的，委托方为广告主；承接内容设计、制作、代理的，为广告经营者；在信源端发布内容的，为广告发布者。这属于执行《广告法》第二条的事项，可以由部门规章作出。第二层是生成式人工智能服务提供者的提示义务，即在回答中呈现带有商业标记的信源内容时，向用户提示其商业来源。提供者在这一场景下不是广告发布者，依《立法法》第九十一条第二款，没有法律或者国务院的行政法规、决定、命令的依据，部门规章不得设定增加其义务的规范；该事项又涉及网信部门与市场监管部门的职权，依第九十二条应由有关部门联合制定规章</w:t>
+        <w:t xml:space="preserve">针对6.1节所述不附购买入口的回答中的缺口，建议分两层处理。第一层在《互联网广告管理办法》中明确主体认定：委托他人制作、分发内容以影响生成式人工智能输出、推销商品或者服务的，委托方为广告主；承接内容设计、制作、代理的，为广告经营者；在信源端发布内容的，为广告发布者。这属于执行《广告法》第二条的事项，可以由部门规章作出。第二层是生成式人工智能服务提供者的提示义务，即在回答中呈现带有商业标记的信源内容时，向用户提示其商业来源。提供者在这一场景下不是广告发布者。依《立法法》第九十一条第二款，部门规章设定增加其义务的规范，须有法律或者国务院的行政法规、决定、命令作为依据；该事项又涉及网信部门与市场监管部门的职权，依第九十二条，应当提请国务院制定行政法规，或者由国务院有关部门联合制定规章</w:t>
       </w:r>
       <w:r>
         <w:rPr>
@@ -8458,7 +8479,49 @@
           <w:sz w:val="24"/>
           <w:szCs w:val="24"/>
         </w:rPr>
-        <w:t xml:space="preserve">。可行的载体有两种：修订《人工智能生成合成内容标识办法》，增设商业来源提示；或者依托市场监管部门参与制定的《互联网信息服务算法推荐管理规定》，该规定已把生成合成类算法纳入算法推荐技术</w:t>
+        <w:t xml:space="preserve">。较稳妥的路径是在修改《广告法》时，于第四十五条增加互联网信息服务提供者对可识别的商业来源予以提示的义务，或者由国务院以行政法规作出规定。在取得上位法依据之前，可以参照执法指南对人工智能技术应用于广告所采用的引导性条款</w:t>
+      </w:r>
+      <w:r>
+        <w:rPr>
+          <w:rFonts w:ascii="Times New Roman" w:cs="Times New Roman" w:eastAsia="宋体" w:hAnsi="Times New Roman"/>
+          <w:b w:val="false"/>
+          <w:bCs w:val="false"/>
+          <w:sz w:val="24"/>
+          <w:szCs w:val="24"/>
+          <w:vertAlign w:val="superscript"/>
+        </w:rPr>
+        <w:t xml:space="preserve">[54]</w:t>
+      </w:r>
+      <w:r>
+        <w:rPr>
+          <w:rFonts w:ascii="Times New Roman" w:cs="Times New Roman" w:eastAsia="宋体" w:hAnsi="Times New Roman"/>
+          <w:b w:val="false"/>
+          <w:bCs w:val="false"/>
+          <w:sz w:val="24"/>
+          <w:szCs w:val="24"/>
+        </w:rPr>
+        <w:t xml:space="preserve">，在《人工智能生成合成内容标识办法》或《互联网信息服务算法推荐管理规定》中以倡导性条款鼓励提供者提示商业来源；前者以国信办通字〔2025〕2号通知印发</w:t>
+      </w:r>
+      <w:r>
+        <w:rPr>
+          <w:rFonts w:ascii="Times New Roman" w:cs="Times New Roman" w:eastAsia="宋体" w:hAnsi="Times New Roman"/>
+          <w:b w:val="false"/>
+          <w:bCs w:val="false"/>
+          <w:sz w:val="24"/>
+          <w:szCs w:val="24"/>
+          <w:vertAlign w:val="superscript"/>
+        </w:rPr>
+        <w:t xml:space="preserve">[56]</w:t>
+      </w:r>
+      <w:r>
+        <w:rPr>
+          <w:rFonts w:ascii="Times New Roman" w:cs="Times New Roman" w:eastAsia="宋体" w:hAnsi="Times New Roman"/>
+          <w:b w:val="false"/>
+          <w:bCs w:val="false"/>
+          <w:sz w:val="24"/>
+          <w:szCs w:val="24"/>
+        </w:rPr>
+        <w:t xml:space="preserve">，后者已把生成合成类算法纳入算法推荐技术</w:t>
       </w:r>
       <w:r>
         <w:rPr>
@@ -8479,7 +8542,7 @@
           <w:sz w:val="24"/>
           <w:szCs w:val="24"/>
         </w:rPr>
-        <w:t xml:space="preserve">。修改《广告法》时，也可以在第四十五条中增加互联网信息服务提供者对可识别的商业来源予以提示的义务。</w:t>
+        <w:t xml:space="preserve">。</w:t>
       </w:r>
     </w:p>
     <w:p>
@@ -8610,7 +8673,7 @@
           <w:sz w:val="24"/>
           <w:szCs w:val="24"/>
         </w:rPr>
-        <w:t xml:space="preserve">7.3 生成式引擎平台：兑现回答独立性承诺</w:t>
+        <w:t xml:space="preserve">7.3 生成式引擎平台：维护回答的独立性</w:t>
       </w:r>
     </w:p>
     <w:p>
@@ -8627,49 +8690,91 @@
           <w:sz w:val="24"/>
           <w:szCs w:val="24"/>
         </w:rPr>
-        <w:t xml:space="preserve">OpenAI和Perplexity都公开承诺广告不影响回答</w:t>
-      </w:r>
-      <w:r>
-        <w:rPr>
-          <w:rFonts w:ascii="Times New Roman" w:cs="Times New Roman" w:eastAsia="宋体" w:hAnsi="Times New Roman"/>
-          <w:b w:val="false"/>
-          <w:bCs w:val="false"/>
-          <w:sz w:val="24"/>
-          <w:szCs w:val="24"/>
-          <w:vertAlign w:val="superscript"/>
-        </w:rPr>
-        <w:t xml:space="preserve">[5,8]</w:t>
-      </w:r>
-      <w:r>
-        <w:rPr>
-          <w:rFonts w:ascii="Times New Roman" w:cs="Times New Roman" w:eastAsia="宋体" w:hAnsi="Times New Roman"/>
-          <w:b w:val="false"/>
-          <w:bCs w:val="false"/>
-          <w:sz w:val="24"/>
-          <w:szCs w:val="24"/>
-        </w:rPr>
-        <w:t xml:space="preserve">，Perplexity退出广告业务、百度推迟AI搜索商业化，也都以回答质量和用户信任为理由</w:t>
-      </w:r>
-      <w:r>
-        <w:rPr>
-          <w:rFonts w:ascii="Times New Roman" w:cs="Times New Roman" w:eastAsia="宋体" w:hAnsi="Times New Roman"/>
-          <w:b w:val="false"/>
-          <w:bCs w:val="false"/>
-          <w:sz w:val="24"/>
-          <w:szCs w:val="24"/>
-          <w:vertAlign w:val="superscript"/>
-        </w:rPr>
-        <w:t xml:space="preserve">[6,13]</w:t>
-      </w:r>
-      <w:r>
-        <w:rPr>
-          <w:rFonts w:ascii="Times New Roman" w:cs="Times New Roman" w:eastAsia="宋体" w:hAnsi="Times New Roman"/>
-          <w:b w:val="false"/>
-          <w:bCs w:val="false"/>
-          <w:sz w:val="24"/>
-          <w:szCs w:val="24"/>
-        </w:rPr>
-        <w:t xml:space="preserve">。兑现这一承诺，平台首先要把付费广告与回答在位置和视觉上分开，并在广告政策中禁止广告主借助第三方内容影响回答；在回答中嵌入购买入口的平台，应依执法指南和《互联网广告管理办法》第九条第三款对构成广告的回答履行发布者的标识义务</w:t>
+        <w:t xml:space="preserve">OpenAI承诺广告不影响ChatGPT的回答</w:t>
+      </w:r>
+      <w:r>
+        <w:rPr>
+          <w:rFonts w:ascii="Times New Roman" w:cs="Times New Roman" w:eastAsia="宋体" w:hAnsi="Times New Roman"/>
+          <w:b w:val="false"/>
+          <w:bCs w:val="false"/>
+          <w:sz w:val="24"/>
+          <w:szCs w:val="24"/>
+          <w:vertAlign w:val="superscript"/>
+        </w:rPr>
+        <w:t xml:space="preserve">[8]</w:t>
+      </w:r>
+      <w:r>
+        <w:rPr>
+          <w:rFonts w:ascii="Times New Roman" w:cs="Times New Roman" w:eastAsia="宋体" w:hAnsi="Times New Roman"/>
+          <w:b w:val="false"/>
+          <w:bCs w:val="false"/>
+          <w:sz w:val="24"/>
+          <w:szCs w:val="24"/>
+        </w:rPr>
+        <w:t xml:space="preserve">，Perplexity承诺赞助追问的回答由其系统生成、品牌不能撰写或编辑</w:t>
+      </w:r>
+      <w:r>
+        <w:rPr>
+          <w:rFonts w:ascii="Times New Roman" w:cs="Times New Roman" w:eastAsia="宋体" w:hAnsi="Times New Roman"/>
+          <w:b w:val="false"/>
+          <w:bCs w:val="false"/>
+          <w:sz w:val="24"/>
+          <w:szCs w:val="24"/>
+          <w:vertAlign w:val="superscript"/>
+        </w:rPr>
+        <w:t xml:space="preserve">[5]</w:t>
+      </w:r>
+      <w:r>
+        <w:rPr>
+          <w:rFonts w:ascii="Times New Roman" w:cs="Times New Roman" w:eastAsia="宋体" w:hAnsi="Times New Roman"/>
+          <w:b w:val="false"/>
+          <w:bCs w:val="false"/>
+          <w:sz w:val="24"/>
+          <w:szCs w:val="24"/>
+        </w:rPr>
+        <w:t xml:space="preserve">；Perplexity以用户信任为由逐步退出广告业务</w:t>
+      </w:r>
+      <w:r>
+        <w:rPr>
+          <w:rFonts w:ascii="Times New Roman" w:cs="Times New Roman" w:eastAsia="宋体" w:hAnsi="Times New Roman"/>
+          <w:b w:val="false"/>
+          <w:bCs w:val="false"/>
+          <w:sz w:val="24"/>
+          <w:szCs w:val="24"/>
+          <w:vertAlign w:val="superscript"/>
+        </w:rPr>
+        <w:t xml:space="preserve">[6]</w:t>
+      </w:r>
+      <w:r>
+        <w:rPr>
+          <w:rFonts w:ascii="Times New Roman" w:cs="Times New Roman" w:eastAsia="宋体" w:hAnsi="Times New Roman"/>
+          <w:b w:val="false"/>
+          <w:bCs w:val="false"/>
+          <w:sz w:val="24"/>
+          <w:szCs w:val="24"/>
+        </w:rPr>
+        <w:t xml:space="preserve">，百度管理层以优先改善回答质量和用户体验为由推迟AI搜索商业化</w:t>
+      </w:r>
+      <w:r>
+        <w:rPr>
+          <w:rFonts w:ascii="Times New Roman" w:cs="Times New Roman" w:eastAsia="宋体" w:hAnsi="Times New Roman"/>
+          <w:b w:val="false"/>
+          <w:bCs w:val="false"/>
+          <w:sz w:val="24"/>
+          <w:szCs w:val="24"/>
+          <w:vertAlign w:val="superscript"/>
+        </w:rPr>
+        <w:t xml:space="preserve">[13]</w:t>
+      </w:r>
+      <w:r>
+        <w:rPr>
+          <w:rFonts w:ascii="Times New Roman" w:cs="Times New Roman" w:eastAsia="宋体" w:hAnsi="Times New Roman"/>
+          <w:b w:val="false"/>
+          <w:bCs w:val="false"/>
+          <w:sz w:val="24"/>
+          <w:szCs w:val="24"/>
+        </w:rPr>
+        <w:t xml:space="preserve">。这些承诺只针对平台自身的广告，但其维护的用户信任同样会因第三方付费内容左右回答而受损。平台首先要把付费广告与回答在位置和视觉上分开，并可在广告政策中禁止广告主以虚构内容或提示注入影响回答；在回答中嵌入购买入口的平台，应依执法指南和《互联网广告管理办法》第九条第三款对构成广告的回答履行发布者的标识义务</w:t>
       </w:r>
       <w:r>
         <w:rPr>
@@ -8787,7 +8892,7 @@
           <w:sz w:val="24"/>
           <w:szCs w:val="24"/>
         </w:rPr>
-        <w:t xml:space="preserve">，这类服务商是其主要对象。《互联网广告管理办法》第十四条已要求广告经营者、广告发布者建立承接登记、审核和档案管理制度，记录、保存广告活动的有关电子数据，档案保存不少于三年；第十五条要求利用算法推荐等方式发布广告的，把算法推荐服务相关规则和广告投放记录记入广告档案</w:t>
+        <w:t xml:space="preserve">，以自营矩阵账号批量发布GEO内容的，其投放方式属于这一任务所指的“矩阵式”投放。《互联网广告管理办法》第十四条已要求广告经营者、广告发布者建立承接登记、审核和档案管理制度，记录、保存广告活动的有关电子数据，档案保存不少于三年；第十五条要求利用算法推荐等方式发布广告的，把算法推荐服务相关规则和广告投放记录记入广告档案</w:t>
       </w:r>
       <w:r>
         <w:rPr>
@@ -8808,28 +8913,49 @@
           <w:sz w:val="24"/>
           <w:szCs w:val="24"/>
         </w:rPr>
-        <w:t xml:space="preserve">。GEO服务商据此应保存内容投放的渠道、账号、数量和时间记录。通过平台账号承接发布的自媒体运营者，是平台用户身份的广告发布者，负有使广告具有可识别性的义务，附加购物链接的测评和体验分享须显著标明“广告”；平台经营者不得阻碍平台用户依法进行文字标注、语音提示等行为</w:t>
-      </w:r>
-      <w:r>
-        <w:rPr>
-          <w:rFonts w:ascii="Times New Roman" w:cs="Times New Roman" w:eastAsia="宋体" w:hAnsi="Times New Roman"/>
-          <w:b w:val="false"/>
-          <w:bCs w:val="false"/>
-          <w:sz w:val="24"/>
-          <w:szCs w:val="24"/>
-          <w:vertAlign w:val="superscript"/>
-        </w:rPr>
-        <w:t xml:space="preserve">[50,54]</w:t>
-      </w:r>
-      <w:r>
-        <w:rPr>
-          <w:rFonts w:ascii="Times New Roman" w:cs="Times New Roman" w:eastAsia="宋体" w:hAnsi="Times New Roman"/>
-          <w:b w:val="false"/>
-          <w:bCs w:val="false"/>
-          <w:sz w:val="24"/>
-          <w:szCs w:val="24"/>
-        </w:rPr>
-        <w:t xml:space="preserve">。在投放内容上写入机器可读的商业标记，目前没有法律依据，属于7.2节的建议，可以先由行业标准规定。中国商务广告协会2026年发布的GEO系列团体标准覆盖基础定义与业务边界、服务商准入、报价计价与效果测量、可信语料质量管控和服务流程合规安全五个方面</w:t>
+        <w:t xml:space="preserve">。GEO服务商应当按照上述规定保存内容投放的渠道、账号、数量和时间记录。通过平台账号承接发布的自媒体运营者，是平台用户身份的广告发布者，负有使广告具有可识别性的义务，附加购物链接的测评和体验分享须显著标明“广告”</w:t>
+      </w:r>
+      <w:r>
+        <w:rPr>
+          <w:rFonts w:ascii="Times New Roman" w:cs="Times New Roman" w:eastAsia="宋体" w:hAnsi="Times New Roman"/>
+          <w:b w:val="false"/>
+          <w:bCs w:val="false"/>
+          <w:sz w:val="24"/>
+          <w:szCs w:val="24"/>
+          <w:vertAlign w:val="superscript"/>
+        </w:rPr>
+        <w:t xml:space="preserve">[50]</w:t>
+      </w:r>
+      <w:r>
+        <w:rPr>
+          <w:rFonts w:ascii="Times New Roman" w:cs="Times New Roman" w:eastAsia="宋体" w:hAnsi="Times New Roman"/>
+          <w:b w:val="false"/>
+          <w:bCs w:val="false"/>
+          <w:sz w:val="24"/>
+          <w:szCs w:val="24"/>
+        </w:rPr>
+        <w:t xml:space="preserve">；平台经营者不得阻碍平台用户依法进行文字标注、语音提示等行为</w:t>
+      </w:r>
+      <w:r>
+        <w:rPr>
+          <w:rFonts w:ascii="Times New Roman" w:cs="Times New Roman" w:eastAsia="宋体" w:hAnsi="Times New Roman"/>
+          <w:b w:val="false"/>
+          <w:bCs w:val="false"/>
+          <w:sz w:val="24"/>
+          <w:szCs w:val="24"/>
+          <w:vertAlign w:val="superscript"/>
+        </w:rPr>
+        <w:t xml:space="preserve">[54]</w:t>
+      </w:r>
+      <w:r>
+        <w:rPr>
+          <w:rFonts w:ascii="Times New Roman" w:cs="Times New Roman" w:eastAsia="宋体" w:hAnsi="Times New Roman"/>
+          <w:b w:val="false"/>
+          <w:bCs w:val="false"/>
+          <w:sz w:val="24"/>
+          <w:szCs w:val="24"/>
+        </w:rPr>
+        <w:t xml:space="preserve">。在投放内容上写入机器可读的商业标记，目前没有法律依据，属于7.2节的建议，可以先由行业标准规定。中国商务广告协会2026年7月就GEO系列团体标准公开征求意见，标准覆盖基础定义与业务边界、服务商准入、报价计价与效果测量、可信语料质量管控和服务流程合规安全五个方面</w:t>
       </w:r>
       <w:r>
         <w:rPr>
@@ -8850,7 +8976,7 @@
           <w:sz w:val="24"/>
           <w:szCs w:val="24"/>
         </w:rPr>
-        <w:t xml:space="preserve">，标准全文公开后，可以对照本文7.2节和7.5节，检验其是否规定商业属性标注和多引擎重复抽样验收。</w:t>
+        <w:t xml:space="preserve">；标准全文公开后，可以对照本文7.2节和7.5节，检验其是否规定商业属性标注和多引擎重复抽样验收。</w:t>
       </w:r>
     </w:p>
     <w:p>
@@ -8926,7 +9052,7 @@
           <w:sz w:val="24"/>
           <w:szCs w:val="24"/>
         </w:rPr>
-        <w:t xml:space="preserve">，在合同中排除此类做法是控制自身法律风险的必要措施。效果验收应采用Martinez提出的重复测量思路：在多个引擎上，以多种问法、在不同时间点重复提问，并人工核验引用内容的保真度</w:t>
+        <w:t xml:space="preserve">，在合同中排除此类做法是控制自身法律风险的必要措施。效果验收应借鉴Martinez提出的可复现测量方案，即重复测量、问法改写、设置对照和人工验证</w:t>
       </w:r>
       <w:r>
         <w:rPr>
@@ -8947,7 +9073,7 @@
           <w:sz w:val="24"/>
           <w:szCs w:val="24"/>
         </w:rPr>
-        <w:t xml:space="preserve">，据此统计品牌的被提及率与提及位置分布。对照可取同品类中未做优化的品牌，用以区分优化效果与引擎自身的变化。</w:t>
+        <w:t xml:space="preserve">：在多个引擎上，以多种问法、在不同时间点重复提问，人工核验引用内容的保真度，据此统计品牌的被提及率与提及位置分布。对照可取同品类中未做优化的品牌，用以区分优化效果与引擎自身的变化。</w:t>
       </w:r>
     </w:p>
     <w:p>
@@ -9065,7 +9191,7 @@
           <w:sz w:val="24"/>
           <w:szCs w:val="24"/>
         </w:rPr>
-        <w:t xml:space="preserve">。两项行动都采取专项整治形式，针对的是投毒和违法内容，没有在制度上规定GEO内容在回答中的商业标识。协作的制度基础已经存在：《互联网信息服务算法推荐管理规定》第三条规定国务院电信、公安、市场监管等有关部门依据各自职责负责算法推荐服务监督管理工作</w:t>
+        <w:t xml:space="preserve">。两项行动都采取专项整治形式：市场监管总局的整治针对人工智能生成式广告、“矩阵式”投放等违法广告及投放方式，中央网信办的专项行动针对训练语料安全、AI数据投毒和生成合成内容标识落实等问题，二者都没有在制度上规定GEO内容在回答中的商业标识。协作的制度基础已经存在：《互联网信息服务算法推荐管理规定》第三条规定国务院电信、公安、市场监管等有关部门依据各自职责负责算法推荐服务监督管理工作</w:t>
       </w:r>
       <w:r>
         <w:rPr>
@@ -9086,7 +9212,7 @@
           <w:sz w:val="24"/>
           <w:szCs w:val="24"/>
         </w:rPr>
-        <w:t xml:space="preserve">。建议以此为依托，把专项整治中形成的做法固定为制度：市场监管部门以广告可识别性、虚假广告和反不正当竞争规则为依据，查处未标识的GEO广告、虚假广告和虚假评价；网信部门把投毒防范的范围从训练语料延伸到检索增强环节的外部信源，并在生成式人工智能服务的备案与安全评估中加入相应要求。执法方式上可以借鉴GEO效果审计的方法，以多引擎、多问法的抽样监测发现异常推荐，再沿信源追溯投放主体。</w:t>
+        <w:t xml:space="preserve">。建议以此为依托，把专项整治中形成的做法固定为制度：市场监管部门以广告可识别性、虚假广告和反不正当竞争规则为依据，查处未标识的GEO广告、虚假广告和虚假评价；网信部门在生成式人工智能服务的备案与安全评估中，明确把检索增强环节所用的外部信源纳入数据投毒防范范围。执法方式上可以借鉴GEO效果审计的方法，以多引擎、多问法的抽样监测发现异常推荐，再沿信源追溯投放主体。</w:t>
       </w:r>
     </w:p>
     <w:p>
@@ -9120,7 +9246,7 @@
           <w:sz w:val="24"/>
           <w:szCs w:val="24"/>
         </w:rPr>
-        <w:t xml:space="preserve">生成式引擎改变了品牌进入用户视野的方式，GEO随之成为一种不经过平台广告系统、以回答正文为载体的广告形态。本文得出四点结论。第一，GEO作用于检索召回、上下文分配和引用生成三个环节，GEO服务采购的是第三方信源上的发布机会；现有研究中最稳定的影响因素是话题相关性和上下文位置，信源是否属于引擎偏好的第三方媒体也影响被引用的机会。第二，AI搜索中的商业信息沿平台广告与购物功能、第三方GEO两条路径进入回答；现行广告规则能够约束信源端的付费内容，附购买入口并构成广告的回答也有平台作为发布者，但在不附购买入口的回答中，没有承担标识义务的广告发布者。第三，GEO与信息操纵作用于同一路径，二者的区别在于内容是否真实、是否利用模型漏洞；操纵型GEO首先落入《广告法》的虚假广告规则，“3·15”晚会中的测试表明，这类操纵能够在国内主流大模型上以低成本实现。第四，零点击化削弱了按点击计价与归因的基础，生成结果的随机性使单次提问不能作为GEO效果的验收依据。在治理上，本文主张按推销目的认定GEO内容的广告属性，在部门规章中明确生成式回答场景下的主体认定，由有关部门联合设定平台的商业来源提示义务，在信源端设置随检索传递、不影响权重的商业标记，要求GEO服务商承担广告经营者与发布者的责任，由广告主以多引擎重复抽样验收效果，并把2026年的专项整治做法固定为跨部门的制度协同。</w:t>
+        <w:t xml:space="preserve">生成式引擎改变了品牌进入用户视野的方式，GEO已被经营者用作一种不经过平台广告系统、以回答正文为载体的广告形态。本文得出四点结论。第一，GEO作用于检索召回、上下文分配和引用生成三个环节，GEO服务采购的主要是第三方信源上的发布机会；现有研究中最可靠的影响因素是话题相关性和上下文位置，信源是否属于引擎偏好的第三方媒体也影响被引用的机会。第二，AI搜索中的商业信息沿平台广告与购物功能、第三方GEO两条路径进入回答；现行广告规则能够约束信源端的付费内容，附购买入口并构成广告的回答也有平台作为发布者，但在不附购买入口的回答中，没有承担标识义务的广告发布者。第三，信息型GEO与操纵型GEO作用于同一路径，二者的区别在于内容是否真实、是否利用模型漏洞；操纵型GEO首先落入《广告法》的虚假广告规则，“3·15”晚会中的测试表明，借助市售GEO软件即可在国内主流大模型上实现这类操纵。第四，零点击化削弱了按点击计价与归因的基础，生成结果的随机性使单次提问不能作为GEO效果的验收依据。在治理上，本文主张按推销目的认定GEO内容的广告属性，在部门规章中明确生成式回答场景下的主体认定，通过修改《广告法》或制定行政法规为生成式人工智能服务提供者设定商业来源提示义务，在信源端设置随检索传递、不影响权重的商业标记，要求GEO服务商承担广告经营者与发布者的责任，由广告主以多引擎重复抽样验收效果，并把2026年的专项整治做法固定为跨部门的制度协同。</w:t>
       </w:r>
     </w:p>
     <w:p>
@@ -9137,7 +9263,7 @@
           <w:sz w:val="24"/>
           <w:szCs w:val="24"/>
         </w:rPr>
-        <w:t xml:space="preserve">本研究有以下局限。平台证据中，境外平台的广告规则有官方说明，国内平台的购物功能主要依据媒体报道；研究基于公开文献、规范文本和媒体报道，未取得GEO服务商和平台的内部数据；文中引用的多项GEO实验来自研究者自建的基准和预印本，其结论适用于相应的实验设置；中文文献通过期刊官网、国家哲学社会科学文献中心和国家自然科学基金委员会网站检索获取，未在中国知网全库检索。后续研究可以在三个方向推进：通过田野实验测量GEO在国内外真实引擎中的效果及其持续时间，检验5.1节提出的结构化信息假设；通过消费者实验检验AI回答中不同商业标记方式对说服知识激活的影响；跟踪GEO相关执法案例和团体标准的实施，检验本文提出的主体认定规则在实践中的可操作性。</w:t>
+        <w:t xml:space="preserve">本研究有以下局限。平台证据中，谷歌和OpenAI的广告规则有官方说明，Perplexity的广告形式与退出决定、百度业绩会表态以及国内平台的购物功能，依据的是媒体报道或第三方实录；研究基于公开文献、规范文本和媒体报道，未取得GEO服务商和平台的内部数据；文中引用的多项GEO实验来自研究者自建的基准和预印本，其结论适用于相应的实验设置；中文文献通过期刊官网、国家哲学社会科学文献中心和国家自然科学基金委员会网站检索获取，未在中国知网全库检索。后续研究可以在三个方向推进：通过田野实验测量GEO在国内外真实引擎中的效果及其持续时间，检验5.1节提出的结构化信息假设；通过消费者实验检验AI回答中不同商业标记方式对说服知识激活的影响；跟踪GEO相关执法案例和团体标准的实施，检验本文提出的主体认定规则在实践中的可操作性。</w:t>
       </w:r>
     </w:p>
     <w:p>

</xml_diff>